<commit_message>
Improve Word formatting for figures and captions
</commit_message>
<xml_diff>
--- a/Final_Paper_updated.docx
+++ b/Final_Paper_updated.docx
@@ -331,6 +331,7 @@
     <w:p>
       <w:pPr>
         <w:pStyle w:val="Caption"/>
+        <w:jc w:val="center"/>
       </w:pPr>
       <w:r>
         <w:t>Table 1 provides descriptive statistics for the primary indices and performance metrics.</w:t>
@@ -339,6 +340,7 @@
     <w:p>
       <w:pPr>
         <w:pStyle w:val="Caption"/>
+        <w:jc w:val="center"/>
       </w:pPr>
       <w:r>
         <w:t>Table 1. Descriptive statistics (branch-level)</w:t>
@@ -348,6 +350,7 @@
       <w:tblPr>
         <w:tblStyle w:val="TableGrid"/>
         <w:tblW w:type="auto" w:w="0"/>
+        <w:jc w:val="center"/>
         <w:tblLook w:firstColumn="1" w:firstRow="1" w:lastColumn="0" w:lastRow="0" w:noHBand="0" w:noVBand="1" w:val="04A0"/>
       </w:tblPr>
       <w:tblGrid>
@@ -725,6 +728,7 @@
     <w:p>
       <w:pPr>
         <w:pStyle w:val="Caption"/>
+        <w:jc w:val="center"/>
       </w:pPr>
       <w:r>
         <w:t>Table 2 reports outcomes by branch size tier.</w:t>
@@ -733,6 +737,7 @@
     <w:p>
       <w:pPr>
         <w:pStyle w:val="Caption"/>
+        <w:jc w:val="center"/>
       </w:pPr>
       <w:r>
         <w:t>Table 2. Size tier means</w:t>
@@ -742,6 +747,7 @@
       <w:tblPr>
         <w:tblStyle w:val="TableGrid"/>
         <w:tblW w:type="auto" w:w="0"/>
+        <w:jc w:val="center"/>
         <w:tblLook w:firstColumn="1" w:firstRow="1" w:lastColumn="0" w:lastRow="0" w:noHBand="0" w:noVBand="1" w:val="04A0"/>
       </w:tblPr>
       <w:tblGrid>
@@ -1057,6 +1063,7 @@
     <w:p>
       <w:pPr>
         <w:pStyle w:val="Caption"/>
+        <w:jc w:val="center"/>
       </w:pPr>
       <w:r>
         <w:t>Table 3 summarizes test-set performance. Linear regression is marginally better than random forest for service quality, while random forest performs slightly better for loyalty. Productivity models exhibit poor fit, suggesting that productivity is not well explained by the available predictors.</w:t>
@@ -1065,6 +1072,7 @@
     <w:p>
       <w:pPr>
         <w:pStyle w:val="Caption"/>
+        <w:jc w:val="center"/>
       </w:pPr>
       <w:r>
         <w:t>Table 3. Model performance (test set)</w:t>
@@ -1074,6 +1082,7 @@
       <w:tblPr>
         <w:tblStyle w:val="TableGrid"/>
         <w:tblW w:type="auto" w:w="0"/>
+        <w:jc w:val="center"/>
         <w:tblLook w:firstColumn="1" w:firstRow="1" w:lastColumn="0" w:lastRow="0" w:noHBand="0" w:noVBand="1" w:val="04A0"/>
       </w:tblPr>
       <w:tblGrid>
@@ -1469,6 +1478,7 @@
     <w:p>
       <w:pPr>
         <w:pStyle w:val="Caption"/>
+        <w:jc w:val="center"/>
       </w:pPr>
       <w:r>
         <w:t>Table 4. Cluster centroids and sizes</w:t>
@@ -1478,6 +1488,7 @@
       <w:tblPr>
         <w:tblStyle w:val="TableGrid"/>
         <w:tblW w:type="auto" w:w="0"/>
+        <w:jc w:val="center"/>
         <w:tblLook w:firstColumn="1" w:firstRow="1" w:lastColumn="0" w:lastRow="0" w:noHBand="0" w:noVBand="1" w:val="04A0"/>
       </w:tblPr>
       <w:tblGrid>
@@ -1753,12 +1764,16 @@
     <w:p>
       <w:pPr>
         <w:pStyle w:val="Caption"/>
+        <w:jc w:val="center"/>
       </w:pPr>
       <w:r>
         <w:t>Figure 1. Correlation heatmap</w:t>
       </w:r>
     </w:p>
     <w:p>
+      <w:pPr>
+        <w:jc w:val="center"/>
+      </w:pPr>
       <w:r>
         <w:drawing>
           <wp:inline xmlns:a="http://schemas.openxmlformats.org/drawingml/2006/main" xmlns:pic="http://schemas.openxmlformats.org/drawingml/2006/picture">
@@ -1797,12 +1812,16 @@
     <w:p>
       <w:pPr>
         <w:pStyle w:val="Caption"/>
+        <w:jc w:val="center"/>
       </w:pPr>
       <w:r>
         <w:t>Figure 2. Employee index vs service quality</w:t>
       </w:r>
     </w:p>
     <w:p>
+      <w:pPr>
+        <w:jc w:val="center"/>
+      </w:pPr>
       <w:r>
         <w:drawing>
           <wp:inline xmlns:a="http://schemas.openxmlformats.org/drawingml/2006/main" xmlns:pic="http://schemas.openxmlformats.org/drawingml/2006/picture">
@@ -1841,12 +1860,16 @@
     <w:p>
       <w:pPr>
         <w:pStyle w:val="Caption"/>
+        <w:jc w:val="center"/>
       </w:pPr>
       <w:r>
         <w:t>Figure 3. Service quality vs customer loyalty</w:t>
       </w:r>
     </w:p>
     <w:p>
+      <w:pPr>
+        <w:jc w:val="center"/>
+      </w:pPr>
       <w:r>
         <w:drawing>
           <wp:inline xmlns:a="http://schemas.openxmlformats.org/drawingml/2006/main" xmlns:pic="http://schemas.openxmlformats.org/drawingml/2006/picture">
@@ -1885,12 +1908,16 @@
     <w:p>
       <w:pPr>
         <w:pStyle w:val="Caption"/>
+        <w:jc w:val="center"/>
       </w:pPr>
       <w:r>
         <w:t>Figure 4. Productivity vs teller transactions</w:t>
       </w:r>
     </w:p>
     <w:p>
+      <w:pPr>
+        <w:jc w:val="center"/>
+      </w:pPr>
       <w:r>
         <w:drawing>
           <wp:inline xmlns:a="http://schemas.openxmlformats.org/drawingml/2006/main" xmlns:pic="http://schemas.openxmlformats.org/drawingml/2006/picture">
@@ -1929,12 +1956,16 @@
     <w:p>
       <w:pPr>
         <w:pStyle w:val="Caption"/>
+        <w:jc w:val="center"/>
       </w:pPr>
       <w:r>
         <w:t>Figure 5. Productivity by branch size tier</w:t>
       </w:r>
     </w:p>
     <w:p>
+      <w:pPr>
+        <w:jc w:val="center"/>
+      </w:pPr>
       <w:r>
         <w:drawing>
           <wp:inline xmlns:a="http://schemas.openxmlformats.org/drawingml/2006/main" xmlns:pic="http://schemas.openxmlformats.org/drawingml/2006/picture">

</xml_diff>